<commit_message>
fix first minus check
</commit_message>
<xml_diff>
--- a/hw1/doc/js-calculator.docx
+++ b/hw1/doc/js-calculator.docx
@@ -1338,13 +1338,7 @@
           <w:rPr>
             <w:rStyle w:val="Hyperlink"/>
           </w:rPr>
-          <w:t>calculator exampl</w:t>
-        </w:r>
-        <w:r>
-          <w:rPr>
-            <w:rStyle w:val="Hyperlink"/>
-          </w:rPr>
-          <w:t>e</w:t>
+          <w:t>calculator example</w:t>
         </w:r>
       </w:hyperlink>
       <w:r>
@@ -2049,11 +2043,11 @@
         </mc:AlternateContent>
       </w:r>
     </w:p>
+    <w:bookmarkStart w:id="11" w:name="_Toc95577836"/>
     <w:p>
       <w:pPr>
         <w:pStyle w:val="Heading3"/>
       </w:pPr>
-      <w:bookmarkStart w:id="11" w:name="_Toc95577836"/>
       <w:r>
         <w:rPr>
           <w:noProof/>
@@ -2136,10 +2130,7 @@
         </mc:AlternateContent>
       </w:r>
       <w:r>
-        <w:t>Calculation</w:t>
-      </w:r>
-      <w:r>
-        <w:t xml:space="preserve"> command</w:t>
+        <w:t>Calculation command</w:t>
       </w:r>
       <w:bookmarkEnd w:id="11"/>
     </w:p>
@@ -2200,23 +2191,7 @@
           <w:sz w:val="24"/>
           <w:szCs w:val="24"/>
         </w:rPr>
-        <w:t>T</w:t>
-      </w:r>
-      <w:r>
-        <w:rPr>
-          <w:rFonts w:ascii="Times New Roman" w:eastAsia="Times New Roman" w:hAnsi="Times New Roman" w:cs="Times New Roman"/>
-          <w:sz w:val="24"/>
-          <w:szCs w:val="24"/>
-        </w:rPr>
-        <w:t>he previous and after numbers are generated</w:t>
-      </w:r>
-      <w:r>
-        <w:rPr>
-          <w:rFonts w:ascii="Times New Roman" w:eastAsia="Times New Roman" w:hAnsi="Times New Roman" w:cs="Times New Roman"/>
-          <w:sz w:val="24"/>
-          <w:szCs w:val="24"/>
-        </w:rPr>
-        <w:t xml:space="preserve"> and the subset calculation is performed</w:t>
+        <w:t>The previous and after numbers are generated and the subset calculation is performed</w:t>
       </w:r>
     </w:p>
     <w:p>
@@ -5022,47 +4997,128 @@
         <w:spacing w:line="270" w:lineRule="atLeast"/>
         <w:rPr>
           <w:rFonts w:ascii="Menlo" w:hAnsi="Menlo" w:cs="Menlo"/>
-          <w:color w:val="000000"/>
-          <w:sz w:val="18"/>
-          <w:szCs w:val="18"/>
-          <w:lang w:eastAsia="en-GB"/>
-        </w:rPr>
-      </w:pPr>
-      <w:r>
-        <w:rPr>
-          <w:rFonts w:ascii="Menlo" w:hAnsi="Menlo" w:cs="Menlo"/>
-          <w:color w:val="000000"/>
-          <w:sz w:val="18"/>
-          <w:szCs w:val="18"/>
-          <w:lang w:eastAsia="en-GB"/>
-        </w:rPr>
-        <w:t xml:space="preserve">    </w:t>
-      </w:r>
-      <w:r>
-        <w:rPr>
-          <w:rFonts w:ascii="Menlo" w:hAnsi="Menlo" w:cs="Menlo"/>
-          <w:color w:val="AF00DB"/>
-          <w:sz w:val="18"/>
-          <w:szCs w:val="18"/>
-          <w:lang w:eastAsia="en-GB"/>
-        </w:rPr>
-        <w:t>else</w:t>
-      </w:r>
-      <w:r>
-        <w:rPr>
-          <w:rFonts w:ascii="Menlo" w:hAnsi="Menlo" w:cs="Menlo"/>
-          <w:color w:val="000000"/>
-          <w:sz w:val="18"/>
-          <w:szCs w:val="18"/>
-          <w:lang w:eastAsia="en-GB"/>
-        </w:rPr>
-        <w:t xml:space="preserve"> {</w:t>
+          <w:color w:val="001080"/>
+          <w:sz w:val="18"/>
+          <w:szCs w:val="18"/>
+          <w:lang w:eastAsia="en-GB"/>
+        </w:rPr>
+      </w:pPr>
+      <w:r>
+        <w:rPr>
+          <w:rFonts w:ascii="Menlo" w:hAnsi="Menlo" w:cs="Menlo"/>
+          <w:color w:val="001080"/>
+          <w:sz w:val="18"/>
+          <w:szCs w:val="18"/>
+          <w:lang w:eastAsia="en-GB"/>
+        </w:rPr>
+        <w:t xml:space="preserve">    else </w:t>
+      </w:r>
+      <w:r>
+        <w:rPr>
+          <w:rFonts w:ascii="Menlo" w:hAnsi="Menlo" w:cs="Menlo"/>
+          <w:color w:val="001080"/>
+          <w:sz w:val="18"/>
+          <w:szCs w:val="18"/>
+          <w:lang w:eastAsia="en-GB"/>
+        </w:rPr>
+        <w:t>if ((</w:t>
+      </w:r>
+      <w:proofErr w:type="gramStart"/>
+      <w:r>
+        <w:rPr>
+          <w:rFonts w:ascii="Menlo" w:hAnsi="Menlo" w:cs="Menlo"/>
+          <w:color w:val="001080"/>
+          <w:sz w:val="18"/>
+          <w:szCs w:val="18"/>
+          <w:lang w:eastAsia="en-GB"/>
+        </w:rPr>
+        <w:t>equation[</w:t>
+      </w:r>
+      <w:proofErr w:type="gramEnd"/>
+      <w:r>
+        <w:rPr>
+          <w:rFonts w:ascii="Menlo" w:hAnsi="Menlo" w:cs="Menlo"/>
+          <w:color w:val="001080"/>
+          <w:sz w:val="18"/>
+          <w:szCs w:val="18"/>
+          <w:lang w:eastAsia="en-GB"/>
+        </w:rPr>
+        <w:t>0] === '-') &amp;&amp; !(</w:t>
+      </w:r>
+      <w:proofErr w:type="spellStart"/>
+      <w:r>
+        <w:rPr>
+          <w:rFonts w:ascii="Menlo" w:hAnsi="Menlo" w:cs="Menlo"/>
+          <w:color w:val="001080"/>
+          <w:sz w:val="18"/>
+          <w:szCs w:val="18"/>
+          <w:lang w:eastAsia="en-GB"/>
+        </w:rPr>
+        <w:t>Number.isInteger</w:t>
+      </w:r>
+      <w:proofErr w:type="spellEnd"/>
+      <w:r>
+        <w:rPr>
+          <w:rFonts w:ascii="Menlo" w:hAnsi="Menlo" w:cs="Menlo"/>
+          <w:color w:val="001080"/>
+          <w:sz w:val="18"/>
+          <w:szCs w:val="18"/>
+          <w:lang w:eastAsia="en-GB"/>
+        </w:rPr>
+        <w:t>(</w:t>
+      </w:r>
+      <w:proofErr w:type="spellStart"/>
+      <w:r>
+        <w:rPr>
+          <w:rFonts w:ascii="Menlo" w:hAnsi="Menlo" w:cs="Menlo"/>
+          <w:color w:val="001080"/>
+          <w:sz w:val="18"/>
+          <w:szCs w:val="18"/>
+          <w:lang w:eastAsia="en-GB"/>
+        </w:rPr>
+        <w:t>parseInt</w:t>
+      </w:r>
+      <w:proofErr w:type="spellEnd"/>
+      <w:r>
+        <w:rPr>
+          <w:rFonts w:ascii="Menlo" w:hAnsi="Menlo" w:cs="Menlo"/>
+          <w:color w:val="001080"/>
+          <w:sz w:val="18"/>
+          <w:szCs w:val="18"/>
+          <w:lang w:eastAsia="en-GB"/>
+        </w:rPr>
+        <w:t>(equation[1]))))</w:t>
       </w:r>
     </w:p>
     <w:p>
       <w:pPr>
         <w:shd w:val="clear" w:color="auto" w:fill="FFFFFF"/>
         <w:spacing w:line="270" w:lineRule="atLeast"/>
+        <w:ind w:left="720"/>
+        <w:rPr>
+          <w:rFonts w:ascii="Menlo" w:hAnsi="Menlo" w:cs="Menlo"/>
+          <w:color w:val="000000"/>
+          <w:sz w:val="18"/>
+          <w:szCs w:val="18"/>
+          <w:lang w:eastAsia="en-GB"/>
+        </w:rPr>
+      </w:pPr>
+      <w:r>
+        <w:rPr>
+          <w:rFonts w:ascii="Menlo" w:hAnsi="Menlo" w:cs="Menlo"/>
+          <w:color w:val="000000"/>
+          <w:sz w:val="18"/>
+          <w:szCs w:val="18"/>
+          <w:lang w:eastAsia="en-GB"/>
+        </w:rPr>
+        <w:t>{</w:t>
+      </w:r>
+    </w:p>
+    <w:p>
+      <w:pPr>
+        <w:shd w:val="clear" w:color="auto" w:fill="FFFFFF"/>
+        <w:spacing w:line="270" w:lineRule="atLeast"/>
+        <w:ind w:left="720"/>
         <w:rPr>
           <w:rFonts w:ascii="Menlo" w:hAnsi="Menlo" w:cs="Menlo"/>
           <w:color w:val="000000"/>
@@ -5120,6 +5176,7 @@
       <w:pPr>
         <w:shd w:val="clear" w:color="auto" w:fill="FFFFFF"/>
         <w:spacing w:line="270" w:lineRule="atLeast"/>
+        <w:ind w:left="720"/>
         <w:rPr>
           <w:rFonts w:ascii="Menlo" w:hAnsi="Menlo" w:cs="Menlo"/>
           <w:color w:val="000000"/>
@@ -5187,6 +5244,7 @@
       <w:pPr>
         <w:shd w:val="clear" w:color="auto" w:fill="FFFFFF"/>
         <w:spacing w:line="270" w:lineRule="atLeast"/>
+        <w:ind w:left="720"/>
         <w:rPr>
           <w:rFonts w:ascii="Menlo" w:hAnsi="Menlo" w:cs="Menlo"/>
           <w:color w:val="000000"/>
@@ -5210,6 +5268,7 @@
       <w:pPr>
         <w:shd w:val="clear" w:color="auto" w:fill="FFFFFF"/>
         <w:spacing w:line="270" w:lineRule="atLeast"/>
+        <w:ind w:left="720"/>
         <w:rPr>
           <w:rFonts w:ascii="Menlo" w:hAnsi="Menlo" w:cs="Menlo"/>
           <w:color w:val="000000"/>
@@ -5357,6 +5416,7 @@
       <w:pPr>
         <w:shd w:val="clear" w:color="auto" w:fill="FFFFFF"/>
         <w:spacing w:line="270" w:lineRule="atLeast"/>
+        <w:ind w:left="720"/>
         <w:rPr>
           <w:rFonts w:ascii="Menlo" w:hAnsi="Menlo" w:cs="Menlo"/>
           <w:color w:val="000000"/>
@@ -6854,19 +6914,6 @@
         </w:rPr>
         <w:t>}</w:t>
       </w:r>
-    </w:p>
-    <w:p>
-      <w:pPr>
-        <w:shd w:val="clear" w:color="auto" w:fill="FFFFFF"/>
-        <w:spacing w:line="270" w:lineRule="atLeast"/>
-        <w:rPr>
-          <w:rFonts w:ascii="Menlo" w:hAnsi="Menlo" w:cs="Menlo"/>
-          <w:color w:val="000000"/>
-          <w:sz w:val="18"/>
-          <w:szCs w:val="18"/>
-          <w:lang w:eastAsia="en-GB"/>
-        </w:rPr>
-      </w:pPr>
     </w:p>
     <w:p>
       <w:pPr>

</xml_diff>